<commit_message>
v0.1.1: fix content-wrapper pruning, tool-independent benchmark cohort, SoftwareX revision
Co-authored-by: Cursor <cursoragent@cursor.com>
</commit_message>
<xml_diff>
--- a/papers/softwarex/COMPETING_INTERESTS_DECLARATION.docx
+++ b/papers/softwarex/COMPETING_INTERESTS_DECLARATION.docx
@@ -41,11 +41,6 @@
       </w:r>
     </w:p>
     <w:p/>
-    <w:p>
-      <w:r>
-        <w:t xml:space="preserve">Note: Elsevier Guide for Authors also asks authors to complete the online declarations tool and upload its generated Word file. This document mirrors the 'nothing to declare' outcome for SoftareX upload if the tool output is unavailable at submit time; prefer uploading the Elsevier tool Word document when you generate it.</w:t>
-      </w:r>
-    </w:p>
     <w:sectPr/>
   </w:body>
 </w:document>

</xml_diff>